<commit_message>
Logica para cargar niveles y sus validaciones
</commit_message>
<xml_diff>
--- a/Documentacion/Documentación-externa-2.docx
+++ b/Documentacion/Documentación-externa-2.docx
@@ -563,13 +563,7 @@
         <w:rPr>
           <w:rFonts w:ascii="Arial" w:hAnsi="Arial" w:cs="Arial"/>
         </w:rPr>
-        <w:t>los niveles disponibles</w:t>
-      </w:r>
-      <w:r>
-        <w:rPr>
-          <w:rFonts w:ascii="Arial" w:hAnsi="Arial" w:cs="Arial"/>
-        </w:rPr>
-        <w:t xml:space="preserve">, </w:t>
+        <w:t xml:space="preserve">los niveles disponibles, </w:t>
       </w:r>
       <w:r>
         <w:rPr>
@@ -1864,14 +1858,12 @@
                 <w:rFonts w:ascii="Arial" w:hAnsi="Arial" w:cs="Arial"/>
               </w:rPr>
             </w:pPr>
-            <w:proofErr w:type="spellStart"/>
             <w:r>
               <w:rPr>
                 <w:rFonts w:ascii="Arial" w:hAnsi="Arial" w:cs="Arial"/>
               </w:rPr>
               <w:t>Commit</w:t>
             </w:r>
-            <w:proofErr w:type="spellEnd"/>
           </w:p>
         </w:tc>
       </w:tr>
@@ -1915,6 +1907,18 @@
                 <w:rFonts w:ascii="Arial" w:hAnsi="Arial" w:cs="Arial"/>
               </w:rPr>
             </w:pPr>
+            <w:r>
+              <w:rPr>
+                <w:rFonts w:ascii="Arial" w:hAnsi="Arial" w:cs="Arial"/>
+              </w:rPr>
+              <w:t>3:</w:t>
+            </w:r>
+            <w:r>
+              <w:rPr>
+                <w:rFonts w:ascii="Arial" w:hAnsi="Arial" w:cs="Arial"/>
+              </w:rPr>
+              <w:t>15</w:t>
+            </w:r>
           </w:p>
         </w:tc>
         <w:tc>
@@ -1927,28 +1931,13 @@
               <w:jc w:val="both"/>
               <w:rPr>
                 <w:rFonts w:ascii="Arial" w:hAnsi="Arial" w:cs="Arial"/>
-                <w:u w:val="single"/>
               </w:rPr>
             </w:pPr>
             <w:r>
               <w:rPr>
                 <w:rFonts w:ascii="Arial" w:hAnsi="Arial" w:cs="Arial"/>
               </w:rPr>
-              <w:t xml:space="preserve">Creación del </w:t>
-            </w:r>
-            <w:proofErr w:type="spellStart"/>
-            <w:r>
-              <w:rPr>
-                <w:rFonts w:ascii="Arial" w:hAnsi="Arial" w:cs="Arial"/>
-              </w:rPr>
-              <w:t>github</w:t>
-            </w:r>
-            <w:proofErr w:type="spellEnd"/>
-            <w:r>
-              <w:rPr>
-                <w:rFonts w:ascii="Arial" w:hAnsi="Arial" w:cs="Arial"/>
-              </w:rPr>
-              <w:t xml:space="preserve">, comienzo de la documentación externa </w:t>
+              <w:t xml:space="preserve">Creación del github, comienzo de la documentación externa </w:t>
             </w:r>
             <w:r>
               <w:rPr>
@@ -1967,6 +1956,27 @@
                 <w:rFonts w:ascii="Arial" w:hAnsi="Arial" w:cs="Arial"/>
               </w:rPr>
               <w:t>, documentación y programa</w:t>
+            </w:r>
+            <w:r>
+              <w:rPr>
+                <w:rFonts w:ascii="Arial" w:hAnsi="Arial" w:cs="Arial"/>
+              </w:rPr>
+              <w:t>.</w:t>
+            </w:r>
+          </w:p>
+          <w:p>
+            <w:pPr>
+              <w:spacing w:after="160" w:line="278" w:lineRule="auto"/>
+              <w:jc w:val="both"/>
+              <w:rPr>
+                <w:rFonts w:ascii="Arial" w:hAnsi="Arial" w:cs="Arial"/>
+              </w:rPr>
+            </w:pPr>
+            <w:r>
+              <w:rPr>
+                <w:rFonts w:ascii="Arial" w:hAnsi="Arial" w:cs="Arial"/>
+              </w:rPr>
+              <w:t xml:space="preserve">     Lógica para cargar los niveles y realizar las validaciones correspondientes</w:t>
             </w:r>
           </w:p>
         </w:tc>
@@ -1990,7 +2000,60 @@
               <w:rPr>
                 <w:rFonts w:ascii="Arial" w:hAnsi="Arial" w:cs="Arial"/>
               </w:rPr>
-              <w:t>Organizar el proyecto en dos carpetas separadas</w:t>
+              <w:t xml:space="preserve">Primer </w:t>
+            </w:r>
+            <w:proofErr w:type="spellStart"/>
+            <w:r>
+              <w:rPr>
+                <w:rFonts w:ascii="Arial" w:hAnsi="Arial" w:cs="Arial"/>
+              </w:rPr>
+              <w:t>commit</w:t>
+            </w:r>
+            <w:proofErr w:type="spellEnd"/>
+            <w:r>
+              <w:rPr>
+                <w:rFonts w:ascii="Arial" w:hAnsi="Arial" w:cs="Arial"/>
+              </w:rPr>
+              <w:t xml:space="preserve">. Organizar el proyecto en 2 carpetas separadas y se empieza la </w:t>
+            </w:r>
+            <w:r>
+              <w:rPr>
+                <w:rFonts w:ascii="Arial" w:hAnsi="Arial" w:cs="Arial"/>
+              </w:rPr>
+              <w:t>documentación</w:t>
+            </w:r>
+            <w:r>
+              <w:rPr>
+                <w:rFonts w:ascii="Arial" w:hAnsi="Arial" w:cs="Arial"/>
+              </w:rPr>
+              <w:t xml:space="preserve"> externa</w:t>
+            </w:r>
+          </w:p>
+          <w:p>
+            <w:pPr>
+              <w:pStyle w:val="Prrafodelista"/>
+              <w:numPr>
+                <w:ilvl w:val="0"/>
+                <w:numId w:val="4"/>
+              </w:numPr>
+              <w:jc w:val="both"/>
+              <w:rPr>
+                <w:rFonts w:ascii="Arial" w:hAnsi="Arial" w:cs="Arial"/>
+              </w:rPr>
+            </w:pPr>
+            <w:proofErr w:type="spellStart"/>
+            <w:r>
+              <w:rPr>
+                <w:rFonts w:ascii="Arial" w:hAnsi="Arial" w:cs="Arial"/>
+              </w:rPr>
+              <w:t>Logica</w:t>
+            </w:r>
+            <w:proofErr w:type="spellEnd"/>
+            <w:r>
+              <w:rPr>
+                <w:rFonts w:ascii="Arial" w:hAnsi="Arial" w:cs="Arial"/>
+              </w:rPr>
+              <w:t xml:space="preserve"> para cargar niveles y sus validaciones</w:t>
             </w:r>
           </w:p>
         </w:tc>

</xml_diff>

<commit_message>
Se agrega la interfaz grafica. Se diseña la base para el contenido que se mostrara por nivel.
</commit_message>
<xml_diff>
--- a/Documentacion/Documentación-externa-2.docx
+++ b/Documentacion/Documentación-externa-2.docx
@@ -501,7 +501,21 @@
         <w:rPr>
           <w:rFonts w:ascii="Arial" w:hAnsi="Arial" w:cs="Arial"/>
         </w:rPr>
-        <w:t xml:space="preserve">Este proyecto busca construir una interfaz grafica con botones y capturando </w:t>
+        <w:t xml:space="preserve">Este proyecto busca construir una interfaz </w:t>
+      </w:r>
+      <w:proofErr w:type="spellStart"/>
+      <w:r>
+        <w:rPr>
+          <w:rFonts w:ascii="Arial" w:hAnsi="Arial" w:cs="Arial"/>
+        </w:rPr>
+        <w:t>grafica</w:t>
+      </w:r>
+      <w:proofErr w:type="spellEnd"/>
+      <w:r>
+        <w:rPr>
+          <w:rFonts w:ascii="Arial" w:hAnsi="Arial" w:cs="Arial"/>
+        </w:rPr>
+        <w:t xml:space="preserve"> con botones y capturando </w:t>
       </w:r>
       <w:r>
         <w:rPr>
@@ -1256,6 +1270,12 @@
                 <w:rFonts w:ascii="Arial" w:hAnsi="Arial" w:cs="Arial"/>
               </w:rPr>
             </w:pPr>
+            <w:r>
+              <w:rPr>
+                <w:rFonts w:ascii="Arial" w:hAnsi="Arial" w:cs="Arial"/>
+              </w:rPr>
+              <w:t xml:space="preserve">Alcanzado </w:t>
+            </w:r>
           </w:p>
         </w:tc>
         <w:tc>
@@ -1858,12 +1878,14 @@
                 <w:rFonts w:ascii="Arial" w:hAnsi="Arial" w:cs="Arial"/>
               </w:rPr>
             </w:pPr>
+            <w:proofErr w:type="spellStart"/>
             <w:r>
               <w:rPr>
                 <w:rFonts w:ascii="Arial" w:hAnsi="Arial" w:cs="Arial"/>
               </w:rPr>
               <w:t>Commit</w:t>
             </w:r>
+            <w:proofErr w:type="spellEnd"/>
           </w:p>
         </w:tc>
       </w:tr>
@@ -1937,7 +1959,21 @@
               <w:rPr>
                 <w:rFonts w:ascii="Arial" w:hAnsi="Arial" w:cs="Arial"/>
               </w:rPr>
-              <w:t xml:space="preserve">Creación del github, comienzo de la documentación externa </w:t>
+              <w:t xml:space="preserve">Creación del </w:t>
+            </w:r>
+            <w:proofErr w:type="spellStart"/>
+            <w:r>
+              <w:rPr>
+                <w:rFonts w:ascii="Arial" w:hAnsi="Arial" w:cs="Arial"/>
+              </w:rPr>
+              <w:t>github</w:t>
+            </w:r>
+            <w:proofErr w:type="spellEnd"/>
+            <w:r>
+              <w:rPr>
+                <w:rFonts w:ascii="Arial" w:hAnsi="Arial" w:cs="Arial"/>
+              </w:rPr>
+              <w:t xml:space="preserve">, comienzo de la documentación externa </w:t>
             </w:r>
             <w:r>
               <w:rPr>
@@ -1977,6 +2013,35 @@
                 <w:rFonts w:ascii="Arial" w:hAnsi="Arial" w:cs="Arial"/>
               </w:rPr>
               <w:t xml:space="preserve">     Lógica para cargar los niveles y realizar las validaciones correspondientes</w:t>
+            </w:r>
+          </w:p>
+          <w:p>
+            <w:pPr>
+              <w:spacing w:after="160" w:line="278" w:lineRule="auto"/>
+              <w:jc w:val="both"/>
+              <w:rPr>
+                <w:rFonts w:ascii="Arial" w:hAnsi="Arial" w:cs="Arial"/>
+              </w:rPr>
+            </w:pPr>
+            <w:r>
+              <w:rPr>
+                <w:rFonts w:ascii="Arial" w:hAnsi="Arial" w:cs="Arial"/>
+              </w:rPr>
+              <w:t xml:space="preserve">     Se agregó el nivel de ejemplo del </w:t>
+            </w:r>
+            <w:proofErr w:type="spellStart"/>
+            <w:r>
+              <w:rPr>
+                <w:rFonts w:ascii="Arial" w:hAnsi="Arial" w:cs="Arial"/>
+              </w:rPr>
+              <w:t>pdf</w:t>
+            </w:r>
+            <w:proofErr w:type="spellEnd"/>
+            <w:r>
+              <w:rPr>
+                <w:rFonts w:ascii="Arial" w:hAnsi="Arial" w:cs="Arial"/>
+              </w:rPr>
+              <w:t xml:space="preserve"> para verificar si funciona correctamente las funciones creadas.</w:t>
             </w:r>
           </w:p>
         </w:tc>
@@ -2014,19 +2079,7 @@
               <w:rPr>
                 <w:rFonts w:ascii="Arial" w:hAnsi="Arial" w:cs="Arial"/>
               </w:rPr>
-              <w:t xml:space="preserve">. Organizar el proyecto en 2 carpetas separadas y se empieza la </w:t>
-            </w:r>
-            <w:r>
-              <w:rPr>
-                <w:rFonts w:ascii="Arial" w:hAnsi="Arial" w:cs="Arial"/>
-              </w:rPr>
-              <w:t>documentación</w:t>
-            </w:r>
-            <w:r>
-              <w:rPr>
-                <w:rFonts w:ascii="Arial" w:hAnsi="Arial" w:cs="Arial"/>
-              </w:rPr>
-              <w:t xml:space="preserve"> externa</w:t>
+              <w:t>. Organizar el proyecto en 2 carpetas separadas y se empieza la documentación externa</w:t>
             </w:r>
           </w:p>
           <w:p>
@@ -2058,6 +2111,206 @@
           </w:p>
         </w:tc>
       </w:tr>
+      <w:tr>
+        <w:trPr>
+          <w:jc w:val="center"/>
+        </w:trPr>
+        <w:tc>
+          <w:tcPr>
+            <w:tcW w:w="1691" w:type="dxa"/>
+          </w:tcPr>
+          <w:p>
+            <w:pPr>
+              <w:jc w:val="both"/>
+              <w:rPr>
+                <w:rFonts w:ascii="Arial" w:hAnsi="Arial" w:cs="Arial"/>
+              </w:rPr>
+            </w:pPr>
+            <w:r>
+              <w:rPr>
+                <w:rFonts w:ascii="Arial" w:hAnsi="Arial" w:cs="Arial"/>
+              </w:rPr>
+              <w:t>26/10/2026</w:t>
+            </w:r>
+          </w:p>
+        </w:tc>
+        <w:tc>
+          <w:tcPr>
+            <w:tcW w:w="1854" w:type="dxa"/>
+          </w:tcPr>
+          <w:p>
+            <w:pPr>
+              <w:jc w:val="both"/>
+              <w:rPr>
+                <w:rFonts w:ascii="Arial" w:hAnsi="Arial" w:cs="Arial"/>
+              </w:rPr>
+            </w:pPr>
+            <w:r>
+              <w:rPr>
+                <w:rFonts w:ascii="Arial" w:hAnsi="Arial" w:cs="Arial"/>
+              </w:rPr>
+              <w:t>1:18</w:t>
+            </w:r>
+          </w:p>
+        </w:tc>
+        <w:tc>
+          <w:tcPr>
+            <w:tcW w:w="3685" w:type="dxa"/>
+          </w:tcPr>
+          <w:p>
+            <w:pPr>
+              <w:jc w:val="both"/>
+              <w:rPr>
+                <w:rFonts w:ascii="Arial" w:hAnsi="Arial" w:cs="Arial"/>
+              </w:rPr>
+            </w:pPr>
+            <w:r>
+              <w:rPr>
+                <w:rFonts w:ascii="Arial" w:hAnsi="Arial" w:cs="Arial"/>
+              </w:rPr>
+              <w:t xml:space="preserve">Se empieza a desarrollar la lógica para la interfaz </w:t>
+            </w:r>
+            <w:r>
+              <w:rPr>
+                <w:rFonts w:ascii="Arial" w:hAnsi="Arial" w:cs="Arial"/>
+              </w:rPr>
+              <w:t>gráfica</w:t>
+            </w:r>
+            <w:r>
+              <w:rPr>
+                <w:rFonts w:ascii="Arial" w:hAnsi="Arial" w:cs="Arial"/>
+              </w:rPr>
+              <w:t xml:space="preserve">, utilizando frames para poder acomodar los botones y </w:t>
+            </w:r>
+            <w:proofErr w:type="spellStart"/>
+            <w:r>
+              <w:rPr>
+                <w:rFonts w:ascii="Arial" w:hAnsi="Arial" w:cs="Arial"/>
+              </w:rPr>
+              <w:t>labels</w:t>
+            </w:r>
+            <w:proofErr w:type="spellEnd"/>
+            <w:r>
+              <w:rPr>
+                <w:rFonts w:ascii="Arial" w:hAnsi="Arial" w:cs="Arial"/>
+              </w:rPr>
+              <w:t xml:space="preserve"> de forma más fácil. </w:t>
+            </w:r>
+          </w:p>
+          <w:p>
+            <w:pPr>
+              <w:jc w:val="both"/>
+              <w:rPr>
+                <w:rFonts w:ascii="Arial" w:hAnsi="Arial" w:cs="Arial"/>
+              </w:rPr>
+            </w:pPr>
+            <w:r>
+              <w:rPr>
+                <w:rFonts w:ascii="Arial" w:hAnsi="Arial" w:cs="Arial"/>
+              </w:rPr>
+              <w:t xml:space="preserve">     También se </w:t>
+            </w:r>
+            <w:proofErr w:type="gramStart"/>
+            <w:r>
+              <w:rPr>
+                <w:rFonts w:ascii="Arial" w:hAnsi="Arial" w:cs="Arial"/>
+              </w:rPr>
+              <w:t>plantea</w:t>
+            </w:r>
+            <w:proofErr w:type="gramEnd"/>
+            <w:r>
+              <w:rPr>
+                <w:rFonts w:ascii="Arial" w:hAnsi="Arial" w:cs="Arial"/>
+              </w:rPr>
+              <w:t xml:space="preserve"> aunque no se aplica aún, la lógica para el flujo interno al momento del usuario presionar una tecla</w:t>
+            </w:r>
+            <w:r>
+              <w:rPr>
+                <w:rFonts w:ascii="Arial" w:hAnsi="Arial" w:cs="Arial"/>
+              </w:rPr>
+              <w:t>, tomando en cuenta validaciones, el movimiento del personaje y el de las patrullas o vigilante.</w:t>
+            </w:r>
+          </w:p>
+          <w:p>
+            <w:pPr>
+              <w:jc w:val="both"/>
+              <w:rPr>
+                <w:rFonts w:ascii="Arial" w:hAnsi="Arial" w:cs="Arial"/>
+              </w:rPr>
+            </w:pPr>
+            <w:r>
+              <w:rPr>
+                <w:rFonts w:ascii="Arial" w:hAnsi="Arial" w:cs="Arial"/>
+              </w:rPr>
+              <w:t xml:space="preserve">     </w:t>
+            </w:r>
+            <w:r>
+              <w:rPr>
+                <w:rFonts w:ascii="Arial" w:hAnsi="Arial" w:cs="Arial"/>
+              </w:rPr>
+              <w:t xml:space="preserve">Se </w:t>
+            </w:r>
+            <w:r>
+              <w:rPr>
+                <w:rFonts w:ascii="Arial" w:hAnsi="Arial" w:cs="Arial"/>
+              </w:rPr>
+              <w:t>actualiza la bitácora de trabajo con lo realizado este día.</w:t>
+            </w:r>
+          </w:p>
+          <w:p>
+            <w:pPr>
+              <w:jc w:val="both"/>
+              <w:rPr>
+                <w:rFonts w:ascii="Arial" w:hAnsi="Arial" w:cs="Arial"/>
+              </w:rPr>
+            </w:pPr>
+          </w:p>
+        </w:tc>
+        <w:tc>
+          <w:tcPr>
+            <w:tcW w:w="3402" w:type="dxa"/>
+          </w:tcPr>
+          <w:p>
+            <w:pPr>
+              <w:pStyle w:val="Prrafodelista"/>
+              <w:numPr>
+                <w:ilvl w:val="0"/>
+                <w:numId w:val="4"/>
+              </w:numPr>
+              <w:jc w:val="both"/>
+              <w:rPr>
+                <w:rFonts w:ascii="Arial" w:hAnsi="Arial" w:cs="Arial"/>
+              </w:rPr>
+            </w:pPr>
+            <w:r>
+              <w:rPr>
+                <w:rFonts w:ascii="Arial" w:hAnsi="Arial" w:cs="Arial"/>
+              </w:rPr>
+              <w:t xml:space="preserve">Se agrega la </w:t>
+            </w:r>
+            <w:r>
+              <w:rPr>
+                <w:rFonts w:ascii="Arial" w:hAnsi="Arial" w:cs="Arial"/>
+              </w:rPr>
+              <w:t xml:space="preserve">interfaz </w:t>
+            </w:r>
+            <w:proofErr w:type="spellStart"/>
+            <w:r>
+              <w:rPr>
+                <w:rFonts w:ascii="Arial" w:hAnsi="Arial" w:cs="Arial"/>
+              </w:rPr>
+              <w:t>grafica</w:t>
+            </w:r>
+            <w:proofErr w:type="spellEnd"/>
+            <w:r>
+              <w:rPr>
+                <w:rFonts w:ascii="Arial" w:hAnsi="Arial" w:cs="Arial"/>
+              </w:rPr>
+              <w:t>. Se diseña la base para el contenido que se mostrara por nivel.</w:t>
+            </w:r>
+          </w:p>
+        </w:tc>
+      </w:tr>
     </w:tbl>
     <w:p>
       <w:pPr>
@@ -2094,6 +2347,7 @@
           <w:b/>
           <w:bCs/>
         </w:rPr>
+        <w:lastRenderedPageBreak/>
         <w:t>Conclusiones:</w:t>
       </w:r>
     </w:p>
@@ -2240,6 +2494,7 @@
         <w:docPartUnique/>
       </w:docPartObj>
     </w:sdtPr>
+    <w:sdtEndPr/>
     <w:sdtContent>
       <w:p>
         <w:pPr>
@@ -3275,6 +3530,7 @@
   <w:style w:type="character" w:default="1" w:styleId="Fuentedeprrafopredeter">
     <w:name w:val="Default Paragraph Font"/>
     <w:uiPriority w:val="1"/>
+    <w:semiHidden/>
     <w:unhideWhenUsed/>
   </w:style>
   <w:style w:type="table" w:default="1" w:styleId="Tablanormal">

</xml_diff>

<commit_message>
Se intenta desarrollar el menu principal, aun por trabajar
</commit_message>
<xml_diff>
--- a/Documentacion/Documentación-externa-2.docx
+++ b/Documentacion/Documentación-externa-2.docx
@@ -2208,21 +2208,7 @@
               <w:rPr>
                 <w:rFonts w:ascii="Arial" w:hAnsi="Arial" w:cs="Arial"/>
               </w:rPr>
-              <w:t xml:space="preserve">     También se </w:t>
-            </w:r>
-            <w:proofErr w:type="gramStart"/>
-            <w:r>
-              <w:rPr>
-                <w:rFonts w:ascii="Arial" w:hAnsi="Arial" w:cs="Arial"/>
-              </w:rPr>
-              <w:t>plantea</w:t>
-            </w:r>
-            <w:proofErr w:type="gramEnd"/>
-            <w:r>
-              <w:rPr>
-                <w:rFonts w:ascii="Arial" w:hAnsi="Arial" w:cs="Arial"/>
-              </w:rPr>
-              <w:t xml:space="preserve"> aunque no se aplica aún, la lógica para el flujo interno al momento del usuario presionar una tecla</w:t>
+              <w:t xml:space="preserve">     También se plantea aunque no se aplica aún, la lógica para el flujo interno al momento del usuario presionar una tecla</w:t>
             </w:r>
             <w:r>
               <w:rPr>
@@ -2311,6 +2297,164 @@
           </w:p>
         </w:tc>
       </w:tr>
+      <w:tr>
+        <w:trPr>
+          <w:jc w:val="center"/>
+        </w:trPr>
+        <w:tc>
+          <w:tcPr>
+            <w:tcW w:w="1691" w:type="dxa"/>
+          </w:tcPr>
+          <w:p>
+            <w:pPr>
+              <w:jc w:val="both"/>
+              <w:rPr>
+                <w:rFonts w:ascii="Arial" w:hAnsi="Arial" w:cs="Arial"/>
+              </w:rPr>
+            </w:pPr>
+            <w:r>
+              <w:rPr>
+                <w:rFonts w:ascii="Arial" w:hAnsi="Arial" w:cs="Arial"/>
+              </w:rPr>
+              <w:t>27/10/2026</w:t>
+            </w:r>
+          </w:p>
+        </w:tc>
+        <w:tc>
+          <w:tcPr>
+            <w:tcW w:w="1854" w:type="dxa"/>
+          </w:tcPr>
+          <w:p>
+            <w:pPr>
+              <w:jc w:val="both"/>
+              <w:rPr>
+                <w:rFonts w:ascii="Arial" w:hAnsi="Arial" w:cs="Arial"/>
+              </w:rPr>
+            </w:pPr>
+            <w:r>
+              <w:rPr>
+                <w:rFonts w:ascii="Arial" w:hAnsi="Arial" w:cs="Arial"/>
+              </w:rPr>
+              <w:t>0:23</w:t>
+            </w:r>
+          </w:p>
+        </w:tc>
+        <w:tc>
+          <w:tcPr>
+            <w:tcW w:w="3685" w:type="dxa"/>
+          </w:tcPr>
+          <w:p>
+            <w:pPr>
+              <w:jc w:val="both"/>
+              <w:rPr>
+                <w:rFonts w:ascii="Arial" w:hAnsi="Arial" w:cs="Arial"/>
+              </w:rPr>
+            </w:pPr>
+            <w:r>
+              <w:rPr>
+                <w:rFonts w:ascii="Arial" w:hAnsi="Arial" w:cs="Arial"/>
+              </w:rPr>
+              <w:t xml:space="preserve">Se intenta avanzar un poco con la interfaz </w:t>
+            </w:r>
+            <w:r>
+              <w:rPr>
+                <w:rFonts w:ascii="Arial" w:hAnsi="Arial" w:cs="Arial"/>
+              </w:rPr>
+              <w:t>gráfica</w:t>
+            </w:r>
+            <w:r>
+              <w:rPr>
+                <w:rFonts w:ascii="Arial" w:hAnsi="Arial" w:cs="Arial"/>
+              </w:rPr>
+              <w:t xml:space="preserve"> </w:t>
+            </w:r>
+            <w:r>
+              <w:rPr>
+                <w:rFonts w:ascii="Arial" w:hAnsi="Arial" w:cs="Arial"/>
+              </w:rPr>
+              <w:t xml:space="preserve">planteando la lógica para la fluides entre </w:t>
+            </w:r>
+            <w:r>
+              <w:rPr>
+                <w:rFonts w:ascii="Arial" w:hAnsi="Arial" w:cs="Arial"/>
+              </w:rPr>
+              <w:lastRenderedPageBreak/>
+              <w:t>pantallas.</w:t>
+            </w:r>
+            <w:r>
+              <w:rPr>
+                <w:rFonts w:ascii="Arial" w:hAnsi="Arial" w:cs="Arial"/>
+              </w:rPr>
+              <w:t xml:space="preserve"> Implementando e investigando como trabajar con </w:t>
+            </w:r>
+            <w:proofErr w:type="spellStart"/>
+            <w:r>
+              <w:rPr>
+                <w:rFonts w:ascii="Arial" w:hAnsi="Arial" w:cs="Arial"/>
+              </w:rPr>
+              <w:t>frames</w:t>
+            </w:r>
+            <w:proofErr w:type="spellEnd"/>
+            <w:r>
+              <w:rPr>
+                <w:rFonts w:ascii="Arial" w:hAnsi="Arial" w:cs="Arial"/>
+              </w:rPr>
+              <w:t xml:space="preserve"> para ordenar todos los </w:t>
+            </w:r>
+            <w:proofErr w:type="spellStart"/>
+            <w:r>
+              <w:rPr>
+                <w:rFonts w:ascii="Arial" w:hAnsi="Arial" w:cs="Arial"/>
+              </w:rPr>
+              <w:t>labels</w:t>
+            </w:r>
+            <w:proofErr w:type="spellEnd"/>
+            <w:r>
+              <w:rPr>
+                <w:rFonts w:ascii="Arial" w:hAnsi="Arial" w:cs="Arial"/>
+              </w:rPr>
+              <w:t xml:space="preserve"> y botones</w:t>
+            </w:r>
+          </w:p>
+        </w:tc>
+        <w:tc>
+          <w:tcPr>
+            <w:tcW w:w="3402" w:type="dxa"/>
+          </w:tcPr>
+          <w:p>
+            <w:pPr>
+              <w:pStyle w:val="Prrafodelista"/>
+              <w:numPr>
+                <w:ilvl w:val="0"/>
+                <w:numId w:val="4"/>
+              </w:numPr>
+              <w:jc w:val="both"/>
+              <w:rPr>
+                <w:rFonts w:ascii="Arial" w:hAnsi="Arial" w:cs="Arial"/>
+              </w:rPr>
+            </w:pPr>
+            <w:r>
+              <w:rPr>
+                <w:rFonts w:ascii="Arial" w:hAnsi="Arial" w:cs="Arial"/>
+              </w:rPr>
+              <w:lastRenderedPageBreak/>
+              <w:t xml:space="preserve">Se intenta desarrollar </w:t>
+            </w:r>
+            <w:r>
+              <w:rPr>
+                <w:rFonts w:ascii="Arial" w:hAnsi="Arial" w:cs="Arial"/>
+              </w:rPr>
+              <w:t>el</w:t>
+            </w:r>
+            <w:r>
+              <w:rPr>
+                <w:rFonts w:ascii="Arial" w:hAnsi="Arial" w:cs="Arial"/>
+              </w:rPr>
+              <w:t xml:space="preserve"> menú principal, aun por trabajar</w:t>
+            </w:r>
+          </w:p>
+        </w:tc>
+      </w:tr>
     </w:tbl>
     <w:p>
       <w:pPr>
@@ -2347,7 +2491,6 @@
           <w:b/>
           <w:bCs/>
         </w:rPr>
-        <w:lastRenderedPageBreak/>
         <w:t>Conclusiones:</w:t>
       </w:r>
     </w:p>

</xml_diff>

<commit_message>
Se crean los .txt que se utilizaran para la permanencia de los datos. Se desarrolla la interfaz grafica colocando el menu principal
</commit_message>
<xml_diff>
--- a/Documentacion/Documentación-externa-2.docx
+++ b/Documentacion/Documentación-externa-2.docx
@@ -501,21 +501,7 @@
         <w:rPr>
           <w:rFonts w:ascii="Arial" w:hAnsi="Arial" w:cs="Arial"/>
         </w:rPr>
-        <w:t xml:space="preserve">Este proyecto busca construir una interfaz </w:t>
-      </w:r>
-      <w:proofErr w:type="spellStart"/>
-      <w:r>
-        <w:rPr>
-          <w:rFonts w:ascii="Arial" w:hAnsi="Arial" w:cs="Arial"/>
-        </w:rPr>
-        <w:t>grafica</w:t>
-      </w:r>
-      <w:proofErr w:type="spellEnd"/>
-      <w:r>
-        <w:rPr>
-          <w:rFonts w:ascii="Arial" w:hAnsi="Arial" w:cs="Arial"/>
-        </w:rPr>
-        <w:t xml:space="preserve"> con botones y capturando </w:t>
+        <w:t xml:space="preserve">Este proyecto busca construir una interfaz grafica con botones y capturando </w:t>
       </w:r>
       <w:r>
         <w:rPr>
@@ -719,30 +705,8 @@
         <w:rPr>
           <w:rFonts w:ascii="Arial" w:hAnsi="Arial" w:cs="Arial"/>
         </w:rPr>
-        <w:t xml:space="preserve">con bucles </w:t>
-      </w:r>
-      <w:proofErr w:type="spellStart"/>
-      <w:r>
-        <w:rPr>
-          <w:rFonts w:ascii="Arial" w:hAnsi="Arial" w:cs="Arial"/>
-        </w:rPr>
-        <w:t>while</w:t>
-      </w:r>
-      <w:proofErr w:type="spellEnd"/>
-      <w:r>
-        <w:rPr>
-          <w:rFonts w:ascii="Arial" w:hAnsi="Arial" w:cs="Arial"/>
-        </w:rPr>
-        <w:t xml:space="preserve"> y condicionales como </w:t>
-      </w:r>
-      <w:proofErr w:type="spellStart"/>
-      <w:r>
-        <w:rPr>
-          <w:rFonts w:ascii="Arial" w:hAnsi="Arial" w:cs="Arial"/>
-        </w:rPr>
-        <w:t>if</w:t>
-      </w:r>
-      <w:proofErr w:type="spellEnd"/>
+        <w:t>con bucles while y condicionales como if</w:t>
+      </w:r>
       <w:r>
         <w:rPr>
           <w:rFonts w:ascii="Arial" w:hAnsi="Arial" w:cs="Arial"/>
@@ -840,21 +804,7 @@
         <w:rPr>
           <w:rFonts w:ascii="Arial" w:hAnsi="Arial" w:cs="Arial"/>
         </w:rPr>
-        <w:t xml:space="preserve">Se implemento la librería de </w:t>
-      </w:r>
-      <w:proofErr w:type="spellStart"/>
-      <w:r>
-        <w:rPr>
-          <w:rFonts w:ascii="Arial" w:hAnsi="Arial" w:cs="Arial"/>
-        </w:rPr>
-        <w:t>tkinter</w:t>
-      </w:r>
-      <w:proofErr w:type="spellEnd"/>
-      <w:r>
-        <w:rPr>
-          <w:rFonts w:ascii="Arial" w:hAnsi="Arial" w:cs="Arial"/>
-        </w:rPr>
-        <w:t xml:space="preserve"> </w:t>
+        <w:t xml:space="preserve">Se implemento la librería de tkinter </w:t>
       </w:r>
       <w:r>
         <w:rPr>
@@ -955,42 +905,14 @@
         <w:rPr>
           <w:rFonts w:ascii="Arial" w:hAnsi="Arial" w:cs="Arial"/>
         </w:rPr>
-        <w:t xml:space="preserve"> ) o a través del archivo comprimido subido al </w:t>
-      </w:r>
-      <w:proofErr w:type="spellStart"/>
-      <w:r>
-        <w:rPr>
-          <w:rFonts w:ascii="Arial" w:hAnsi="Arial" w:cs="Arial"/>
-        </w:rPr>
-        <w:t>Tec</w:t>
-      </w:r>
-      <w:proofErr w:type="spellEnd"/>
-      <w:r>
-        <w:rPr>
-          <w:rFonts w:ascii="Arial" w:hAnsi="Arial" w:cs="Arial"/>
-        </w:rPr>
-        <w:t xml:space="preserve"> Digital. Cabe destacar que para el correcto </w:t>
+        <w:t xml:space="preserve"> ) o a través del archivo comprimido subido al Tec Digital. Cabe destacar que para el correcto </w:t>
       </w:r>
       <w:r>
         <w:rPr>
           <w:rFonts w:ascii="Arial" w:hAnsi="Arial" w:cs="Arial"/>
         </w:rPr>
         <w:lastRenderedPageBreak/>
-        <w:t>funcionamiento del programa también es necesario incluir en esta descarga todos los archivos de texto(.</w:t>
-      </w:r>
-      <w:proofErr w:type="spellStart"/>
-      <w:r>
-        <w:rPr>
-          <w:rFonts w:ascii="Arial" w:hAnsi="Arial" w:cs="Arial"/>
-        </w:rPr>
-        <w:t>txt</w:t>
-      </w:r>
-      <w:proofErr w:type="spellEnd"/>
-      <w:r>
-        <w:rPr>
-          <w:rFonts w:ascii="Arial" w:hAnsi="Arial" w:cs="Arial"/>
-        </w:rPr>
-        <w:t xml:space="preserve">) necesarios. </w:t>
+        <w:t xml:space="preserve">funcionamiento del programa también es necesario incluir en esta descarga todos los archivos de texto(.txt) necesarios. </w:t>
       </w:r>
     </w:p>
     <w:p>
@@ -1678,13 +1600,7 @@
         <w:rPr>
           <w:rFonts w:ascii="Arial" w:hAnsi="Arial" w:cs="Arial"/>
         </w:rPr>
-        <w:t>Se logró cumplir con varios objetivos, entre ellos el correcto funcionamiento y navegación entre los diferentes menús y submenús, verificación para la clave de acceso al menú administrativo</w:t>
-      </w:r>
-      <w:r>
-        <w:rPr>
-          <w:rFonts w:ascii="Arial" w:hAnsi="Arial" w:cs="Arial"/>
-        </w:rPr>
-        <w:t xml:space="preserve">. </w:t>
+        <w:t>Se logró cumplir con varios objetivos, entre ellos el correcto funcionamiento y navegación entre los diferentes menús y submenús</w:t>
       </w:r>
     </w:p>
     <w:p>
@@ -1758,7 +1674,19 @@
         <w:rPr>
           <w:rFonts w:ascii="Arial" w:hAnsi="Arial" w:cs="Arial"/>
         </w:rPr>
-        <w:t>figuran las opciones del menú de usuario y las ultimas opciones del menú administrativo. Esto debido principalmente a una mala distribución del tiempo para trabajar en el proyecto, pocas horas al in</w:t>
+        <w:t xml:space="preserve">figuran </w:t>
+      </w:r>
+      <w:r>
+        <w:rPr>
+          <w:rFonts w:ascii="Arial" w:hAnsi="Arial" w:cs="Arial"/>
+        </w:rPr>
+        <w:t xml:space="preserve">… </w:t>
+      </w:r>
+      <w:r>
+        <w:rPr>
+          <w:rFonts w:ascii="Arial" w:hAnsi="Arial" w:cs="Arial"/>
+        </w:rPr>
+        <w:t>Esto debido principalmente a una mala distribución del tiempo para trabajar en el proyecto, pocas horas al in</w:t>
       </w:r>
       <w:r>
         <w:rPr>
@@ -1878,14 +1806,12 @@
                 <w:rFonts w:ascii="Arial" w:hAnsi="Arial" w:cs="Arial"/>
               </w:rPr>
             </w:pPr>
-            <w:proofErr w:type="spellStart"/>
             <w:r>
               <w:rPr>
                 <w:rFonts w:ascii="Arial" w:hAnsi="Arial" w:cs="Arial"/>
               </w:rPr>
               <w:t>Commit</w:t>
             </w:r>
-            <w:proofErr w:type="spellEnd"/>
           </w:p>
         </w:tc>
       </w:tr>
@@ -1959,21 +1885,7 @@
               <w:rPr>
                 <w:rFonts w:ascii="Arial" w:hAnsi="Arial" w:cs="Arial"/>
               </w:rPr>
-              <w:t xml:space="preserve">Creación del </w:t>
-            </w:r>
-            <w:proofErr w:type="spellStart"/>
-            <w:r>
-              <w:rPr>
-                <w:rFonts w:ascii="Arial" w:hAnsi="Arial" w:cs="Arial"/>
-              </w:rPr>
-              <w:t>github</w:t>
-            </w:r>
-            <w:proofErr w:type="spellEnd"/>
-            <w:r>
-              <w:rPr>
-                <w:rFonts w:ascii="Arial" w:hAnsi="Arial" w:cs="Arial"/>
-              </w:rPr>
-              <w:t xml:space="preserve">, comienzo de la documentación externa </w:t>
+              <w:t xml:space="preserve">Creación del github, comienzo de la documentación externa </w:t>
             </w:r>
             <w:r>
               <w:rPr>
@@ -2027,21 +1939,7 @@
               <w:rPr>
                 <w:rFonts w:ascii="Arial" w:hAnsi="Arial" w:cs="Arial"/>
               </w:rPr>
-              <w:t xml:space="preserve">     Se agregó el nivel de ejemplo del </w:t>
-            </w:r>
-            <w:proofErr w:type="spellStart"/>
-            <w:r>
-              <w:rPr>
-                <w:rFonts w:ascii="Arial" w:hAnsi="Arial" w:cs="Arial"/>
-              </w:rPr>
-              <w:t>pdf</w:t>
-            </w:r>
-            <w:proofErr w:type="spellEnd"/>
-            <w:r>
-              <w:rPr>
-                <w:rFonts w:ascii="Arial" w:hAnsi="Arial" w:cs="Arial"/>
-              </w:rPr>
-              <w:t xml:space="preserve"> para verificar si funciona correctamente las funciones creadas.</w:t>
+              <w:t xml:space="preserve">     Se agregó el nivel de ejemplo del pdf para verificar si funciona correctamente las funciones creadas.</w:t>
             </w:r>
           </w:p>
         </w:tc>
@@ -2065,21 +1963,7 @@
               <w:rPr>
                 <w:rFonts w:ascii="Arial" w:hAnsi="Arial" w:cs="Arial"/>
               </w:rPr>
-              <w:t xml:space="preserve">Primer </w:t>
-            </w:r>
-            <w:proofErr w:type="spellStart"/>
-            <w:r>
-              <w:rPr>
-                <w:rFonts w:ascii="Arial" w:hAnsi="Arial" w:cs="Arial"/>
-              </w:rPr>
-              <w:t>commit</w:t>
-            </w:r>
-            <w:proofErr w:type="spellEnd"/>
-            <w:r>
-              <w:rPr>
-                <w:rFonts w:ascii="Arial" w:hAnsi="Arial" w:cs="Arial"/>
-              </w:rPr>
-              <w:t>. Organizar el proyecto en 2 carpetas separadas y se empieza la documentación externa</w:t>
+              <w:t>Primer commit. Organizar el proyecto en 2 carpetas separadas y se empieza la documentación externa</w:t>
             </w:r>
           </w:p>
           <w:p>
@@ -2094,19 +1978,11 @@
                 <w:rFonts w:ascii="Arial" w:hAnsi="Arial" w:cs="Arial"/>
               </w:rPr>
             </w:pPr>
-            <w:proofErr w:type="spellStart"/>
-            <w:r>
-              <w:rPr>
-                <w:rFonts w:ascii="Arial" w:hAnsi="Arial" w:cs="Arial"/>
-              </w:rPr>
-              <w:t>Logica</w:t>
-            </w:r>
-            <w:proofErr w:type="spellEnd"/>
-            <w:r>
-              <w:rPr>
-                <w:rFonts w:ascii="Arial" w:hAnsi="Arial" w:cs="Arial"/>
-              </w:rPr>
-              <w:t xml:space="preserve"> para cargar niveles y sus validaciones</w:t>
+            <w:r>
+              <w:rPr>
+                <w:rFonts w:ascii="Arial" w:hAnsi="Arial" w:cs="Arial"/>
+              </w:rPr>
+              <w:t>Logica para cargar niveles y sus validaciones</w:t>
             </w:r>
           </w:p>
         </w:tc>
@@ -2180,21 +2056,7 @@
               <w:rPr>
                 <w:rFonts w:ascii="Arial" w:hAnsi="Arial" w:cs="Arial"/>
               </w:rPr>
-              <w:t xml:space="preserve">, utilizando frames para poder acomodar los botones y </w:t>
-            </w:r>
-            <w:proofErr w:type="spellStart"/>
-            <w:r>
-              <w:rPr>
-                <w:rFonts w:ascii="Arial" w:hAnsi="Arial" w:cs="Arial"/>
-              </w:rPr>
-              <w:t>labels</w:t>
-            </w:r>
-            <w:proofErr w:type="spellEnd"/>
-            <w:r>
-              <w:rPr>
-                <w:rFonts w:ascii="Arial" w:hAnsi="Arial" w:cs="Arial"/>
-              </w:rPr>
-              <w:t xml:space="preserve"> de forma más fácil. </w:t>
+              <w:t xml:space="preserve">, utilizando frames para poder acomodar los botones y labels de forma más fácil. </w:t>
             </w:r>
           </w:p>
           <w:p>
@@ -2278,21 +2140,7 @@
               <w:rPr>
                 <w:rFonts w:ascii="Arial" w:hAnsi="Arial" w:cs="Arial"/>
               </w:rPr>
-              <w:t xml:space="preserve">interfaz </w:t>
-            </w:r>
-            <w:proofErr w:type="spellStart"/>
-            <w:r>
-              <w:rPr>
-                <w:rFonts w:ascii="Arial" w:hAnsi="Arial" w:cs="Arial"/>
-              </w:rPr>
-              <w:t>grafica</w:t>
-            </w:r>
-            <w:proofErr w:type="spellEnd"/>
-            <w:r>
-              <w:rPr>
-                <w:rFonts w:ascii="Arial" w:hAnsi="Arial" w:cs="Arial"/>
-              </w:rPr>
-              <w:t>. Se diseña la base para el contenido que se mostrara por nivel.</w:t>
+              <w:t>interfaz grafica. Se diseña la base para el contenido que se mostrara por nivel.</w:t>
             </w:r>
           </w:p>
         </w:tc>
@@ -2372,48 +2220,20 @@
               <w:rPr>
                 <w:rFonts w:ascii="Arial" w:hAnsi="Arial" w:cs="Arial"/>
               </w:rPr>
-              <w:t xml:space="preserve">planteando la lógica para la fluides entre </w:t>
+              <w:t>planteando la lógica para la fluides entre pantallas.</w:t>
+            </w:r>
+            <w:r>
+              <w:rPr>
+                <w:rFonts w:ascii="Arial" w:hAnsi="Arial" w:cs="Arial"/>
+              </w:rPr>
+              <w:t xml:space="preserve"> Implementando e </w:t>
             </w:r>
             <w:r>
               <w:rPr>
                 <w:rFonts w:ascii="Arial" w:hAnsi="Arial" w:cs="Arial"/>
               </w:rPr>
               <w:lastRenderedPageBreak/>
-              <w:t>pantallas.</w:t>
-            </w:r>
-            <w:r>
-              <w:rPr>
-                <w:rFonts w:ascii="Arial" w:hAnsi="Arial" w:cs="Arial"/>
-              </w:rPr>
-              <w:t xml:space="preserve"> Implementando e investigando como trabajar con </w:t>
-            </w:r>
-            <w:proofErr w:type="spellStart"/>
-            <w:r>
-              <w:rPr>
-                <w:rFonts w:ascii="Arial" w:hAnsi="Arial" w:cs="Arial"/>
-              </w:rPr>
-              <w:t>frames</w:t>
-            </w:r>
-            <w:proofErr w:type="spellEnd"/>
-            <w:r>
-              <w:rPr>
-                <w:rFonts w:ascii="Arial" w:hAnsi="Arial" w:cs="Arial"/>
-              </w:rPr>
-              <w:t xml:space="preserve"> para ordenar todos los </w:t>
-            </w:r>
-            <w:proofErr w:type="spellStart"/>
-            <w:r>
-              <w:rPr>
-                <w:rFonts w:ascii="Arial" w:hAnsi="Arial" w:cs="Arial"/>
-              </w:rPr>
-              <w:t>labels</w:t>
-            </w:r>
-            <w:proofErr w:type="spellEnd"/>
-            <w:r>
-              <w:rPr>
-                <w:rFonts w:ascii="Arial" w:hAnsi="Arial" w:cs="Arial"/>
-              </w:rPr>
-              <w:t xml:space="preserve"> y botones</w:t>
+              <w:t>investigando como trabajar con frames para ordenar todos los labels y botones</w:t>
             </w:r>
           </w:p>
         </w:tc>
@@ -2452,6 +2272,142 @@
               </w:rPr>
               <w:t xml:space="preserve"> menú principal, aun por trabajar</w:t>
             </w:r>
+          </w:p>
+        </w:tc>
+      </w:tr>
+      <w:tr>
+        <w:trPr>
+          <w:jc w:val="center"/>
+        </w:trPr>
+        <w:tc>
+          <w:tcPr>
+            <w:tcW w:w="1691" w:type="dxa"/>
+          </w:tcPr>
+          <w:p>
+            <w:pPr>
+              <w:jc w:val="both"/>
+              <w:rPr>
+                <w:rFonts w:ascii="Arial" w:hAnsi="Arial" w:cs="Arial"/>
+              </w:rPr>
+            </w:pPr>
+            <w:r>
+              <w:rPr>
+                <w:rFonts w:ascii="Arial" w:hAnsi="Arial" w:cs="Arial"/>
+              </w:rPr>
+              <w:t>31/10/2026</w:t>
+            </w:r>
+          </w:p>
+        </w:tc>
+        <w:tc>
+          <w:tcPr>
+            <w:tcW w:w="1854" w:type="dxa"/>
+          </w:tcPr>
+          <w:p>
+            <w:pPr>
+              <w:jc w:val="both"/>
+              <w:rPr>
+                <w:rFonts w:ascii="Arial" w:hAnsi="Arial" w:cs="Arial"/>
+              </w:rPr>
+            </w:pPr>
+          </w:p>
+        </w:tc>
+        <w:tc>
+          <w:tcPr>
+            <w:tcW w:w="3685" w:type="dxa"/>
+          </w:tcPr>
+          <w:p>
+            <w:pPr>
+              <w:jc w:val="both"/>
+              <w:rPr>
+                <w:rFonts w:ascii="Arial" w:hAnsi="Arial" w:cs="Arial"/>
+              </w:rPr>
+            </w:pPr>
+            <w:r>
+              <w:rPr>
+                <w:rFonts w:ascii="Arial" w:hAnsi="Arial" w:cs="Arial"/>
+              </w:rPr>
+              <w:t>Se desarrolla la interfaz gr</w:t>
+            </w:r>
+            <w:r>
+              <w:rPr>
+                <w:rFonts w:ascii="Arial" w:hAnsi="Arial" w:cs="Arial"/>
+              </w:rPr>
+              <w:t>áfica</w:t>
+            </w:r>
+            <w:r>
+              <w:rPr>
+                <w:rFonts w:ascii="Arial" w:hAnsi="Arial" w:cs="Arial"/>
+              </w:rPr>
+              <w:t>:</w:t>
+            </w:r>
+          </w:p>
+          <w:p>
+            <w:pPr>
+              <w:jc w:val="both"/>
+              <w:rPr>
+                <w:rFonts w:ascii="Arial" w:hAnsi="Arial" w:cs="Arial"/>
+              </w:rPr>
+            </w:pPr>
+            <w:r>
+              <w:rPr>
+                <w:rFonts w:ascii="Arial" w:hAnsi="Arial" w:cs="Arial"/>
+              </w:rPr>
+              <w:t xml:space="preserve">    M</w:t>
+            </w:r>
+            <w:r>
+              <w:rPr>
+                <w:rFonts w:ascii="Arial" w:hAnsi="Arial" w:cs="Arial"/>
+              </w:rPr>
+              <w:t>enú principal(Nueva partida, cargar partida, ranking, salir)</w:t>
+            </w:r>
+          </w:p>
+          <w:p>
+            <w:pPr>
+              <w:jc w:val="both"/>
+              <w:rPr>
+                <w:rFonts w:ascii="Arial" w:hAnsi="Arial" w:cs="Arial"/>
+              </w:rPr>
+            </w:pPr>
+            <w:r>
+              <w:rPr>
+                <w:rFonts w:ascii="Arial" w:hAnsi="Arial" w:cs="Arial"/>
+              </w:rPr>
+              <w:t xml:space="preserve">    Selección de nivel</w:t>
+            </w:r>
+          </w:p>
+          <w:p>
+            <w:pPr>
+              <w:jc w:val="both"/>
+              <w:rPr>
+                <w:rFonts w:ascii="Arial" w:hAnsi="Arial" w:cs="Arial"/>
+              </w:rPr>
+            </w:pPr>
+            <w:r>
+              <w:rPr>
+                <w:rFonts w:ascii="Arial" w:hAnsi="Arial" w:cs="Arial"/>
+              </w:rPr>
+              <w:t xml:space="preserve">    Mostrar </w:t>
+            </w:r>
+            <w:r>
+              <w:rPr>
+                <w:rFonts w:ascii="Arial" w:hAnsi="Arial" w:cs="Arial"/>
+              </w:rPr>
+              <w:t>mejores marcas</w:t>
+            </w:r>
+          </w:p>
+        </w:tc>
+        <w:tc>
+          <w:tcPr>
+            <w:tcW w:w="3402" w:type="dxa"/>
+          </w:tcPr>
+          <w:p>
+            <w:pPr>
+              <w:pStyle w:val="Prrafodelista"/>
+              <w:jc w:val="both"/>
+              <w:rPr>
+                <w:rFonts w:ascii="Arial" w:hAnsi="Arial" w:cs="Arial"/>
+              </w:rPr>
+            </w:pPr>
           </w:p>
         </w:tc>
       </w:tr>
@@ -2637,7 +2593,6 @@
         <w:docPartUnique/>
       </w:docPartObj>
     </w:sdtPr>
-    <w:sdtEndPr/>
     <w:sdtContent>
       <w:p>
         <w:pPr>

</xml_diff>